<commit_message>
Final asset update: Synchronized interactive DOCX resume
</commit_message>
<xml_diff>
--- a/public/Jinal_Dod_Resume.docx
+++ b/public/Jinal_Dod_Resume.docx
@@ -8,8 +8,9 @@
       </w:pPr>
       <w:r>
         <w:rPr>
-          <w:rFonts w:ascii="Arial" w:hAnsi="Arial"/>
+          <w:rFonts w:ascii="Crimson Pro" w:hAnsi="Crimson Pro"/>
           <w:b/>
+          <w:color w:val="2C6AAB"/>
           <w:sz w:val="48"/>
         </w:rPr>
         <w:t>JINAL DOD</w:t>
@@ -21,6 +22,7 @@
       </w:pPr>
       <w:r>
         <w:rPr>
+          <w:rFonts w:ascii="Crimson Pro" w:hAnsi="Crimson Pro"/>
           <w:b/>
           <w:sz w:val="20"/>
         </w:rPr>
@@ -35,32 +37,80 @@
         <w:rPr>
           <w:sz w:val="18"/>
         </w:rPr>
-        <w:t>Ahmedabad, India 380058 | +91 8320708960 | jinaldod8151@gmail.com | linkedin.com/in/jinal-dod-8956b716a/</w:t>
+        <w:t xml:space="preserve">Ahmedabad, India 380058 | +91 8320708960 | </w:t>
       </w:r>
+      <w:hyperlink r:id="rId9">
+        <w:r>
+          <w:rPr>
+            <w:rStyle w:val="Hyperlink"/>
+          </w:rPr>
+          <w:t>jinaldod8151@gmail.com</w:t>
+        </w:r>
+      </w:hyperlink>
+      <w:r>
+        <w:rPr>
+          <w:sz w:val="18"/>
+        </w:rPr>
+        <w:t xml:space="preserve"> | </w:t>
+      </w:r>
+      <w:hyperlink r:id="rId10">
+        <w:r>
+          <w:rPr>
+            <w:rStyle w:val="Hyperlink"/>
+          </w:rPr>
+          <w:t>LinkedIn</w:t>
+        </w:r>
+      </w:hyperlink>
+      <w:r>
+        <w:rPr>
+          <w:sz w:val="18"/>
+        </w:rPr>
+        <w:t xml:space="preserve"> | </w:t>
+      </w:r>
+      <w:hyperlink r:id="rId11">
+        <w:r>
+          <w:rPr>
+            <w:rStyle w:val="Hyperlink"/>
+          </w:rPr>
+          <w:t>Portfolio</w:t>
+        </w:r>
+      </w:hyperlink>
     </w:p>
-    <w:p/>
     <w:p>
       <w:pPr>
-        <w:pStyle w:val="Heading1"/>
+        <w:pStyle w:val="Heading2"/>
       </w:pPr>
       <w:r>
-        <w:t>PROFESSIONAL SUMMARY</w:t>
-      </w:r>
-    </w:p>
-    <w:p>
-      <w:r>
-        <w:t>Dynamic Senior Odoo Developer with 4.5+ years of experience specializing in ERP solutions and custom module creation. Proven track record in complex API integrations and performance optimization, while mentoring teams to deliver high-quality projects. Adept in PostgreSQL scripting and committed to enhancing business efficiency through innovative ERP architecture.</w:t>
+        <w:rPr>
+          <w:color w:val="2C6AAB"/>
+        </w:rPr>
+        <w:t>SUMMARY</w:t>
       </w:r>
     </w:p>
     <w:p>
       <w:pPr>
-        <w:pStyle w:val="Heading1"/>
+        <w:spacing w:after="120"/>
       </w:pPr>
       <w:r>
-        <w:t>TECHNICAL SKILLS</w:t>
+        <w:t>Dynamic Senior Odoo Developer with 4.5+ years of experience specializing in ERP solutions and custom module creation. Proven track record in complex API integrations and performance optimization, while mentoring teams to deliver high-quality projects. Adept in advanced PostgreSQL scripting and committed to enhancing business efficiency through innovative ERP architecture.</w:t>
       </w:r>
     </w:p>
     <w:p>
+      <w:pPr>
+        <w:pStyle w:val="Heading2"/>
+      </w:pPr>
+      <w:r>
+        <w:rPr>
+          <w:color w:val="2C6AAB"/>
+        </w:rPr>
+        <w:t>SKILLS</w:t>
+      </w:r>
+    </w:p>
+    <w:p>
+      <w:pPr>
+        <w:pStyle w:val="ListBullet"/>
+        <w:spacing w:after="40"/>
+      </w:pPr>
       <w:r>
         <w:rPr>
           <w:b/>
@@ -68,10 +118,14 @@
         <w:t xml:space="preserve">ERP Development: </w:t>
       </w:r>
       <w:r>
-        <w:t>Odoo v10-v19, Odoo.sh, Full ERP Cycle, Custom Modules</w:t>
+        <w:t>Odoo (v10–v19), Odoo.sh, Full ERP Cycle, Custom Modules, Odoo Frontend Development</w:t>
       </w:r>
     </w:p>
     <w:p>
+      <w:pPr>
+        <w:pStyle w:val="ListBullet"/>
+        <w:spacing w:after="40"/>
+      </w:pPr>
       <w:r>
         <w:rPr>
           <w:b/>
@@ -79,10 +133,14 @@
         <w:t xml:space="preserve">Databases: </w:t>
       </w:r>
       <w:r>
-        <w:t>PostgreSQL, MySQL</w:t>
+        <w:t>PostgreSQL (Scripting), MySQL, Database Management</w:t>
       </w:r>
     </w:p>
     <w:p>
+      <w:pPr>
+        <w:pStyle w:val="ListBullet"/>
+        <w:spacing w:after="40"/>
+      </w:pPr>
       <w:r>
         <w:rPr>
           <w:b/>
@@ -94,6 +152,10 @@
       </w:r>
     </w:p>
     <w:p>
+      <w:pPr>
+        <w:pStyle w:val="ListBullet"/>
+        <w:spacing w:after="40"/>
+      </w:pPr>
       <w:r>
         <w:rPr>
           <w:b/>
@@ -105,6 +167,10 @@
       </w:r>
     </w:p>
     <w:p>
+      <w:pPr>
+        <w:pStyle w:val="ListBullet"/>
+        <w:spacing w:after="40"/>
+      </w:pPr>
       <w:r>
         <w:rPr>
           <w:b/>
@@ -116,22 +182,14 @@
       </w:r>
     </w:p>
     <w:p>
+      <w:pPr>
+        <w:pStyle w:val="Heading2"/>
+      </w:pPr>
       <w:r>
         <w:rPr>
-          <w:b/>
+          <w:color w:val="2C6AAB"/>
         </w:rPr>
-        <w:t xml:space="preserve">Others: </w:t>
-      </w:r>
-      <w:r>
-        <w:t>Workflow Automation, Bug Fixing, Performance Optimization, UI/UX Enhancement</w:t>
-      </w:r>
-    </w:p>
-    <w:p>
-      <w:pPr>
-        <w:pStyle w:val="Heading1"/>
-      </w:pPr>
-      <w:r>
-        <w:t>PROFESSIONAL EXPERIENCE</w:t>
+        <w:t>EXPERIENCE</w:t>
       </w:r>
     </w:p>
     <w:p>
@@ -139,19 +197,20 @@
         <w:rPr>
           <w:b/>
         </w:rPr>
-        <w:t>Senior Odoo Developer | Wanbuffer Services, Ahmedabad</w:t>
+        <w:t>09/2025 – Current</w:t>
+        <w:tab/>
       </w:r>
       <w:r>
         <w:rPr>
-          <w:i/>
+          <w:b/>
         </w:rPr>
-        <w:tab/>
-        <w:t>03/2025 – Present</w:t>
+        <w:t>Senior Odoo Developer | Wanbuffer Services – Ahmedabad</w:t>
       </w:r>
     </w:p>
     <w:p>
       <w:pPr>
         <w:pStyle w:val="ListBullet"/>
+        <w:spacing w:after="40"/>
       </w:pPr>
       <w:r>
         <w:t>Led design, development, and customization of Odoo ERP solutions across Inventory, Manufacturing, Sales, Purchase, and Accounting modules.</w:t>
@@ -160,6 +219,7 @@
     <w:p>
       <w:pPr>
         <w:pStyle w:val="ListBullet"/>
+        <w:spacing w:after="40"/>
       </w:pPr>
       <w:r>
         <w:t>Developed advanced Activity Calendar functionality for improved task planning, scheduling, and operational tracking.</w:t>
@@ -168,6 +228,7 @@
     <w:p>
       <w:pPr>
         <w:pStyle w:val="ListBullet"/>
+        <w:spacing w:after="40"/>
       </w:pPr>
       <w:r>
         <w:t>Implemented end-to-end eCommerce integration with Shopify and ShipStation, automating order lifecycle.</w:t>
@@ -176,17 +237,28 @@
     <w:p>
       <w:pPr>
         <w:pStyle w:val="ListBullet"/>
+        <w:spacing w:after="40"/>
       </w:pPr>
       <w:r>
-        <w:t>Built reliable real-time data sync mechanisms with mapping, validation, and retry logic.</w:t>
+        <w:t>Designed and implemented complete 3PL logistics workflows covering inbound, storage, picking, packing, and outbound operations.</w:t>
       </w:r>
     </w:p>
     <w:p>
       <w:pPr>
         <w:pStyle w:val="ListBullet"/>
+        <w:spacing w:after="40"/>
       </w:pPr>
       <w:r>
-        <w:t>Designed and implemented complete 3PL logistics workflows covering inbound, storage, picking, and packing.</w:t>
+        <w:t>Created Python and PostgreSQL scripts for data migration and database correction in production environments.</w:t>
+      </w:r>
+    </w:p>
+    <w:p>
+      <w:pPr>
+        <w:pStyle w:val="ListBullet"/>
+        <w:spacing w:after="40"/>
+      </w:pPr>
+      <w:r>
+        <w:t>Designed and developed a document scanning module in Odoo using OCR/AI APIs.</w:t>
       </w:r>
     </w:p>
     <w:p>
@@ -194,19 +266,20 @@
         <w:rPr>
           <w:b/>
         </w:rPr>
-        <w:t>Odoo Developer | Kanak Infosystems LLP, Gandhinagar</w:t>
+        <w:t>08/2023 – 08/2025</w:t>
+        <w:tab/>
       </w:r>
       <w:r>
         <w:rPr>
-          <w:i/>
+          <w:b/>
         </w:rPr>
-        <w:tab/>
-        <w:t>08/2023 – 02/2025</w:t>
+        <w:t>Odoo Developer | Kanak Infosystems LLP – Gandhinagar</w:t>
       </w:r>
     </w:p>
     <w:p>
       <w:pPr>
         <w:pStyle w:val="ListBullet"/>
+        <w:spacing w:after="40"/>
       </w:pPr>
       <w:r>
         <w:t>Designed and implemented custom Odoo modules across sales, purchase, accounting, inventory, and POS.</w:t>
@@ -215,6 +288,7 @@
     <w:p>
       <w:pPr>
         <w:pStyle w:val="ListBullet"/>
+        <w:spacing w:after="40"/>
       </w:pPr>
       <w:r>
         <w:t>Enhanced ERP workflows through custom APIs and integrated third-party payment gateways.</w:t>
@@ -223,6 +297,7 @@
     <w:p>
       <w:pPr>
         <w:pStyle w:val="ListBullet"/>
+        <w:spacing w:after="40"/>
       </w:pPr>
       <w:r>
         <w:t>Developed QWeb-based UI templates for intuitive and responsive user experiences.</w:t>
@@ -231,24 +306,71 @@
     <w:p>
       <w:pPr>
         <w:pStyle w:val="ListBullet"/>
+        <w:spacing w:after="40"/>
       </w:pPr>
       <w:r>
-        <w:t>Led as a dedicated developer on key client projects, ensuring timely delivery.</w:t>
+        <w:t>Conducted on-site client visits (Dubai) for process mapping and requirement gathering.</w:t>
+      </w:r>
+    </w:p>
+    <w:p>
+      <w:r>
+        <w:rPr>
+          <w:b/>
+        </w:rPr>
+        <w:t>08/2021 – 08/2023</w:t>
+        <w:tab/>
+      </w:r>
+      <w:r>
+        <w:rPr>
+          <w:b/>
+        </w:rPr>
+        <w:t>Odoo Developer | Odoo India Pvt. Ltd. – Gandhinagar</w:t>
       </w:r>
     </w:p>
     <w:p>
       <w:pPr>
         <w:pStyle w:val="ListBullet"/>
+        <w:spacing w:after="40"/>
       </w:pPr>
       <w:r>
-        <w:t>Conducted on-site client visits (Ahmedabad, Dubai) for process mapping and requirement gathering.</w:t>
+        <w:t>Customized and developed advanced Odoo modules across versions 13 to 16.</w:t>
       </w:r>
     </w:p>
     <w:p>
       <w:pPr>
-        <w:pStyle w:val="Heading1"/>
+        <w:pStyle w:val="ListBullet"/>
+        <w:spacing w:after="40"/>
       </w:pPr>
       <w:r>
+        <w:t>Implemented value-adding business features like POS promotions and forecast-based reporting.</w:t>
+      </w:r>
+    </w:p>
+    <w:p>
+      <w:pPr>
+        <w:pStyle w:val="ListBullet"/>
+        <w:spacing w:after="40"/>
+      </w:pPr>
+      <w:r>
+        <w:t>Enhanced Many2One (M2O) widget behavior with dynamic filters and contextual domain logic.</w:t>
+      </w:r>
+    </w:p>
+    <w:p>
+      <w:pPr>
+        <w:pStyle w:val="ListBullet"/>
+        <w:spacing w:after="40"/>
+      </w:pPr>
+      <w:r>
+        <w:t>Upgraded and maintained third-party payment gateways including Klarna and Vipps.</w:t>
+      </w:r>
+    </w:p>
+    <w:p>
+      <w:pPr>
+        <w:pStyle w:val="Heading2"/>
+      </w:pPr>
+      <w:r>
+        <w:rPr>
+          <w:color w:val="2C6AAB"/>
+        </w:rPr>
         <w:t>EDUCATION</w:t>
       </w:r>
     </w:p>
@@ -257,13 +379,14 @@
         <w:rPr>
           <w:b/>
         </w:rPr>
-        <w:t>Bachelor of Engineering (BE), Information Technology</w:t>
+        <w:t>2016 – 2020</w:t>
+        <w:tab/>
       </w:r>
       <w:r>
-        <w:br/>
-        <w:t>Shantilal Shah Government Engineering College, Bhavnagar</w:t>
-        <w:tab/>
-        <w:t>2016 – 2020</w:t>
+        <w:rPr>
+          <w:b/>
+        </w:rPr>
+        <w:t>Bachelor of Engineering (BE), Information Technology, Shantilal Shah Government Engineering College, Bhavnagar (GTU)</w:t>
       </w:r>
     </w:p>
     <w:p>
@@ -271,13 +394,14 @@
         <w:rPr>
           <w:b/>
         </w:rPr>
-        <w:t>Higher Secondary Education</w:t>
+        <w:t>2014 – 2016</w:t>
+        <w:tab/>
       </w:r>
       <w:r>
-        <w:br/>
-        <w:t>Smt. R.C. Patel Secondary &amp; Higher Secondary School, Gandhinagar</w:t>
-        <w:tab/>
-        <w:t>2014 – 2016</w:t>
+        <w:rPr>
+          <w:b/>
+        </w:rPr>
+        <w:t>Higher Secondary Education, Smt. R.C. Patel Secondary &amp; Higher Secondary School, Gandhinagar</w:t>
       </w:r>
     </w:p>
     <w:sectPr>
@@ -653,9 +777,6 @@
     <w:name w:val="Normal"/>
     <w:qFormat/>
     <w:rsid w:val="00FC693F"/>
-    <w:rPr>
-      <w:sz w:val="18"/>
-    </w:rPr>
   </w:style>
   <w:style w:type="paragraph" w:styleId="Header">
     <w:name w:val="header"/>
@@ -1185,9 +1306,6 @@
       </w:numPr>
       <w:contextualSpacing/>
     </w:pPr>
-    <w:rPr>
-      <w:sz w:val="18"/>
-    </w:rPr>
   </w:style>
   <w:style w:type="paragraph" w:styleId="ListBullet2">
     <w:name w:val="List Bullet 2"/>

</xml_diff>

<commit_message>
Final asset update: Synchronized interactive DOCX resume with full detail
</commit_message>
<xml_diff>
--- a/public/Jinal_Dod_Resume.docx
+++ b/public/Jinal_Dod_Resume.docx
@@ -89,7 +89,7 @@
     </w:p>
     <w:p>
       <w:pPr>
-        <w:spacing w:after="120"/>
+        <w:spacing w:after="40"/>
       </w:pPr>
       <w:r>
         <w:t>Dynamic Senior Odoo Developer with 4.5+ years of experience specializing in ERP solutions and custom module creation. Proven track record in complex API integrations and performance optimization, while mentoring teams to deliver high-quality projects. Adept in advanced PostgreSQL scripting and committed to enhancing business efficiency through innovative ERP architecture.</w:t>
@@ -109,7 +109,7 @@
     <w:p>
       <w:pPr>
         <w:pStyle w:val="ListBullet"/>
-        <w:spacing w:after="40"/>
+        <w:spacing w:after="20"/>
       </w:pPr>
       <w:r>
         <w:rPr>
@@ -124,7 +124,7 @@
     <w:p>
       <w:pPr>
         <w:pStyle w:val="ListBullet"/>
-        <w:spacing w:after="40"/>
+        <w:spacing w:after="20"/>
       </w:pPr>
       <w:r>
         <w:rPr>
@@ -139,7 +139,7 @@
     <w:p>
       <w:pPr>
         <w:pStyle w:val="ListBullet"/>
-        <w:spacing w:after="40"/>
+        <w:spacing w:after="20"/>
       </w:pPr>
       <w:r>
         <w:rPr>
@@ -154,7 +154,7 @@
     <w:p>
       <w:pPr>
         <w:pStyle w:val="ListBullet"/>
-        <w:spacing w:after="40"/>
+        <w:spacing w:after="20"/>
       </w:pPr>
       <w:r>
         <w:rPr>
@@ -169,7 +169,7 @@
     <w:p>
       <w:pPr>
         <w:pStyle w:val="ListBullet"/>
-        <w:spacing w:after="40"/>
+        <w:spacing w:after="20"/>
       </w:pPr>
       <w:r>
         <w:rPr>
@@ -210,7 +210,7 @@
     <w:p>
       <w:pPr>
         <w:pStyle w:val="ListBullet"/>
-        <w:spacing w:after="40"/>
+        <w:spacing w:after="20"/>
       </w:pPr>
       <w:r>
         <w:t>Led design, development, and customization of Odoo ERP solutions across Inventory, Manufacturing, Sales, Purchase, and Accounting modules.</w:t>
@@ -219,7 +219,7 @@
     <w:p>
       <w:pPr>
         <w:pStyle w:val="ListBullet"/>
-        <w:spacing w:after="40"/>
+        <w:spacing w:after="20"/>
       </w:pPr>
       <w:r>
         <w:t>Developed advanced Activity Calendar functionality for improved task planning, scheduling, and operational tracking.</w:t>
@@ -228,16 +228,16 @@
     <w:p>
       <w:pPr>
         <w:pStyle w:val="ListBullet"/>
-        <w:spacing w:after="40"/>
+        <w:spacing w:after="20"/>
       </w:pPr>
       <w:r>
-        <w:t>Implemented end-to-end eCommerce integration with Shopify and ShipStation, automating order lifecycle.</w:t>
+        <w:t>Implemented end-to-end eCommerce integration with Shopify and ShipStation, including checkout process, order lifecycle, and automated customer synchronization via APIs and webhooks, shipment process.</w:t>
       </w:r>
     </w:p>
     <w:p>
       <w:pPr>
         <w:pStyle w:val="ListBullet"/>
-        <w:spacing w:after="40"/>
+        <w:spacing w:after="20"/>
       </w:pPr>
       <w:r>
         <w:t>Designed and implemented complete 3PL logistics workflows covering inbound, storage, picking, packing, and outbound operations.</w:t>
@@ -246,7 +246,25 @@
     <w:p>
       <w:pPr>
         <w:pStyle w:val="ListBullet"/>
-        <w:spacing w:after="40"/>
+        <w:spacing w:after="20"/>
+      </w:pPr>
+      <w:r>
+        <w:t>Implemented mobile-integrated damage return workflows for real-time warehouse and QC operations.</w:t>
+      </w:r>
+    </w:p>
+    <w:p>
+      <w:pPr>
+        <w:pStyle w:val="ListBullet"/>
+        <w:spacing w:after="20"/>
+      </w:pPr>
+      <w:r>
+        <w:t>Developed BOM versioning and multi-level BOM consumption logic along with projection planning reports for manufacturing and demand forecasting.</w:t>
+      </w:r>
+    </w:p>
+    <w:p>
+      <w:pPr>
+        <w:pStyle w:val="ListBullet"/>
+        <w:spacing w:after="20"/>
       </w:pPr>
       <w:r>
         <w:t>Created Python and PostgreSQL scripts for data migration and database correction in production environments.</w:t>
@@ -255,10 +273,37 @@
     <w:p>
       <w:pPr>
         <w:pStyle w:val="ListBullet"/>
-        <w:spacing w:after="40"/>
+        <w:spacing w:after="20"/>
       </w:pPr>
       <w:r>
-        <w:t>Designed and developed a document scanning module in Odoo using OCR/AI APIs.</w:t>
+        <w:t>Mentored junior developers, conducted trainings and technical interviews, and supported team members through code reviews and debugging.</w:t>
+      </w:r>
+    </w:p>
+    <w:p>
+      <w:pPr>
+        <w:pStyle w:val="ListBullet"/>
+        <w:spacing w:after="20"/>
+      </w:pPr>
+      <w:r>
+        <w:t>Collaborated with functional teams for requirement gathering and ERP implementation ensuring scalable and business-aligned solutions.</w:t>
+      </w:r>
+    </w:p>
+    <w:p>
+      <w:pPr>
+        <w:pStyle w:val="ListBullet"/>
+        <w:spacing w:after="20"/>
+      </w:pPr>
+      <w:r>
+        <w:t>Designed and developed a document scanning module in Odoo to process Vendor Bills, Delivery Challans, and Resumes using OCR/AI APIs.</w:t>
+      </w:r>
+    </w:p>
+    <w:p>
+      <w:pPr>
+        <w:pStyle w:val="ListBullet"/>
+        <w:spacing w:after="20"/>
+      </w:pPr>
+      <w:r>
+        <w:t>Integrated external APIs to extract structured data and sentiment analysis scores from uploaded documents.</w:t>
       </w:r>
     </w:p>
     <w:p>
@@ -279,7 +324,7 @@
     <w:p>
       <w:pPr>
         <w:pStyle w:val="ListBullet"/>
-        <w:spacing w:after="40"/>
+        <w:spacing w:after="20"/>
       </w:pPr>
       <w:r>
         <w:t>Designed and implemented custom Odoo modules across sales, purchase, accounting, inventory, and POS.</w:t>
@@ -288,7 +333,7 @@
     <w:p>
       <w:pPr>
         <w:pStyle w:val="ListBullet"/>
-        <w:spacing w:after="40"/>
+        <w:spacing w:after="20"/>
       </w:pPr>
       <w:r>
         <w:t>Enhanced ERP workflows through custom APIs and integrated third-party payment gateways.</w:t>
@@ -297,7 +342,7 @@
     <w:p>
       <w:pPr>
         <w:pStyle w:val="ListBullet"/>
-        <w:spacing w:after="40"/>
+        <w:spacing w:after="20"/>
       </w:pPr>
       <w:r>
         <w:t>Developed QWeb-based UI templates for intuitive and responsive user experiences.</w:t>
@@ -306,7 +351,7 @@
     <w:p>
       <w:pPr>
         <w:pStyle w:val="ListBullet"/>
-        <w:spacing w:after="40"/>
+        <w:spacing w:after="20"/>
       </w:pPr>
       <w:r>
         <w:t>Conducted on-site client visits (Dubai) for process mapping and requirement gathering.</w:t>
@@ -330,7 +375,7 @@
     <w:p>
       <w:pPr>
         <w:pStyle w:val="ListBullet"/>
-        <w:spacing w:after="40"/>
+        <w:spacing w:after="20"/>
       </w:pPr>
       <w:r>
         <w:t>Customized and developed advanced Odoo modules across versions 13 to 16.</w:t>
@@ -339,7 +384,7 @@
     <w:p>
       <w:pPr>
         <w:pStyle w:val="ListBullet"/>
-        <w:spacing w:after="40"/>
+        <w:spacing w:after="20"/>
       </w:pPr>
       <w:r>
         <w:t>Implemented value-adding business features like POS promotions and forecast-based reporting.</w:t>
@@ -348,7 +393,7 @@
     <w:p>
       <w:pPr>
         <w:pStyle w:val="ListBullet"/>
-        <w:spacing w:after="40"/>
+        <w:spacing w:after="20"/>
       </w:pPr>
       <w:r>
         <w:t>Enhanced Many2One (M2O) widget behavior with dynamic filters and contextual domain logic.</w:t>
@@ -357,7 +402,7 @@
     <w:p>
       <w:pPr>
         <w:pStyle w:val="ListBullet"/>
-        <w:spacing w:after="40"/>
+        <w:spacing w:after="20"/>
       </w:pPr>
       <w:r>
         <w:t>Upgraded and maintained third-party payment gateways including Klarna and Vipps.</w:t>
@@ -406,7 +451,7 @@
     </w:p>
     <w:sectPr>
       <w:pgSz w:w="12240" w:h="15840"/>
-      <w:pgMar w:top="720" w:right="720" w:bottom="720" w:left="720" w:header="720" w:footer="720" w:gutter="0"/>
+      <w:pgMar w:top="576" w:right="720" w:bottom="576" w:left="720" w:header="720" w:footer="720" w:gutter="0"/>
       <w:cols w:space="720"/>
       <w:docGrid w:linePitch="360"/>
     </w:sectPr>

</xml_diff>